<commit_message>
BV-E2 K1: Standardvorlage neu mit --standard, Tests nachgezogen
Standardvorlage mit dem Werkzeug aus dem Merge erzeugt (beispiel
--standard): Kapitelkoepfe als {{text.kapitel_*}}, Logo der Kopfzeile
als Bildplatzhalter {{bild.ersteller.logo}}, custom.xml mit
Katalogfassung 2, keine Kommentare; ein zweiter Lauf schreibt dieselben
Bytes. Die Deckungswache liest die Vorlage ohne Hilfsgriff und verlangt
den Logoplatzhalter. Beispielvorlage ohne Logo: der Bildplatzhalter der
Kopfzeile entfaellt samt Bildteil. Neuer Fall: das Logo sitzt seitentreu
im Rahmen der Standardvorlage (857250 x 285750 EMU fuer 3:1).

Co-Authored-By: Claude Opus 5.5 <noreply@anthropic.com>
</commit_message>
<xml_diff>
--- a/WindowsFormsApplication1/Allgemein/Bericht/Vorlagen/Berichtsvorlage_Standard.docx
+++ b/WindowsFormsApplication1/Allgemein/Bericht/Vorlagen/Berichtsvorlage_Standard.docx
@@ -6,7 +6,6 @@
       <w:pPr>
         <w:pStyle w:val="Title"/>
       </w:pPr>
-      <w:commentRangeStart w:id="0"/>
       <w:r>
         <w:rPr>
           <w:noProof/>
@@ -297,33 +296,27 @@
         </w:rPr>
         <w:t xml:space="preserve">{{ersteller.version}}</w:t>
       </w:r>
-      <w:commentRangeEnd w:id="0"/>
-      <w:r>
-        <w:commentReference w:id="0"/>
-      </w:r>
     </w:p>
     <w:p>
       <w:pPr>
         <w:pStyle w:val="Normal"/>
       </w:pPr>
-      <w:commentRangeStart w:id="1"/>
       <w:r>
         <w:rPr>
           <w:noProof/>
         </w:rPr>
         <w:t xml:space="preserve">{{kapitel.inhalt}}</w:t>
       </w:r>
-      <w:commentRangeEnd w:id="1"/>
-      <w:r>
-        <w:commentReference w:id="1"/>
-      </w:r>
     </w:p>
     <w:p>
       <w:pPr>
         <w:pStyle w:val="EPOSKapitelkopf"/>
       </w:pPr>
       <w:r>
-        <w:t xml:space="preserve">Projektbeschreibung</w:t>
+        <w:rPr>
+          <w:noProof/>
+        </w:rPr>
+        <w:t xml:space="preserve">{{text.kapitel_projekt}}</w:t>
       </w:r>
     </w:p>
     <w:p>
@@ -342,7 +335,10 @@
         <w:pStyle w:val="EPOSKapitelkopf"/>
       </w:pPr>
       <w:r>
-        <w:t xml:space="preserve">Komponenten &amp; Varianten</w:t>
+        <w:rPr>
+          <w:noProof/>
+        </w:rPr>
+        <w:t xml:space="preserve">{{text.kapitel_komponenten}}</w:t>
       </w:r>
     </w:p>
     <w:p>
@@ -361,7 +357,10 @@
         <w:pStyle w:val="EPOSKapitelkopf"/>
       </w:pPr>
       <w:r>
-        <w:t xml:space="preserve">Berechnungsergebnisse je Variante</w:t>
+        <w:rPr>
+          <w:noProof/>
+        </w:rPr>
+        <w:t xml:space="preserve">{{text.kapitel_ergebnisse}}</w:t>
       </w:r>
     </w:p>
     <w:p>
@@ -380,7 +379,10 @@
         <w:pStyle w:val="EPOSKapitelkopf"/>
       </w:pPr>
       <w:r>
-        <w:t xml:space="preserve">Variantenvergleich</w:t>
+        <w:rPr>
+          <w:noProof/>
+        </w:rPr>
+        <w:t xml:space="preserve">{{text.kapitel_vergleich}}</w:t>
       </w:r>
     </w:p>
     <w:p>
@@ -399,7 +401,10 @@
         <w:pStyle w:val="EPOSKapitelkopf"/>
       </w:pPr>
       <w:r>
-        <w:t xml:space="preserve">Wirtschaftlichkeit</w:t>
+        <w:rPr>
+          <w:noProof/>
+        </w:rPr>
+        <w:t xml:space="preserve">{{text.kapitel_wirtschaftlichkeit}}</w:t>
       </w:r>
     </w:p>
     <w:p>
@@ -418,7 +423,10 @@
         <w:pStyle w:val="EPOSKapitelkopf"/>
       </w:pPr>
       <w:r>
-        <w:t xml:space="preserve">Anhang</w:t>
+        <w:rPr>
+          <w:noProof/>
+        </w:rPr>
+        <w:t xml:space="preserve">{{text.kapitel_anhang}}</w:t>
       </w:r>
     </w:p>
     <w:p>
@@ -437,7 +445,10 @@
         <w:pStyle w:val="EPOSKapitelkopf"/>
       </w:pPr>
       <w:r>
-        <w:t xml:space="preserve">Checkliste für den Bewertungsbericht (DIN EN 17463, Anhang E)</w:t>
+        <w:rPr>
+          <w:noProof/>
+        </w:rPr>
+        <w:t xml:space="preserve">{{text.kapitel_anhang_e}}</w:t>
       </w:r>
     </w:p>
     <w:p>
@@ -464,43 +475,7 @@
 </file>
 
 <file path=word/comments.xml><?xml version="1.0" encoding="utf-8"?>
-<w:comments xmlns:w="http://schemas.openxmlformats.org/wordprocessingml/2006/main">
-  <w:comment w:initials="EP" w:author="EPOS-Plan" w:id="0">
-    <w:p>
-      <w:r>
-        <w:annotationRef/>
-      </w:r>
-      <w:r>
-        <w:t xml:space="preserve">Beispielvorlage des Berichts. Text in doppelten geschweiften Klammern ist ein Platzhalter, etwa {{projekt.kunde}}: Beim Erstellen des Berichts setzt EPOS-Plan an seine Stelle den Wert aus dem Projekt. Schrift, Größe und Farbe des Platzhalters gelten für den eingesetzten Wert. Hinter einem senkrechten Strich folgt wahlweise eine Formatangabe, etwa |leer statt strich: Fehlt der Wert, bleibt die Stelle leer.</w:t>
-      </w:r>
-    </w:p>
-    <w:p>
-      <w:r>
-        <w:t xml:space="preserve">Beschriftungen wie {{text.kunde}} erscheinen in der Sprache der Oberfläche, so bleibt die Vorlage sprachneutral. Platzhalter dürfen verschoben, formatiert und gelöscht werden; der Text zwischen den Klammern muss unverändert bleiben. Auch Kopf- und Fußzeile tragen Platzhalter, die Seitenzahlen sind Word-Felder. Das Deckblatt ist ein eigener Abschnitt ohne Kopf- und Fußzeile.</w:t>
-      </w:r>
-    </w:p>
-    <w:p>
-      <w:r>
-        <w:t xml:space="preserve">Diese Datei ist aus dem bisherigen Bericht abgeleitet und die spätere Standardvorlage des Word-Berichts. Kommentare erscheinen nicht im fertigen Bericht.</w:t>
-      </w:r>
-    </w:p>
-  </w:comment>
-  <w:comment w:initials="EP" w:author="EPOS-Plan" w:id="1">
-    <w:p>
-      <w:r>
-        <w:annotationRef/>
-      </w:r>
-      <w:r>
-        <w:t xml:space="preserve">Ein Kapitelplatzhalter wie {{kapitel.inhalt}} steht allein in seinem Absatz. Beim Erstellen ersetzt EPOS-Plan den ganzen Absatz durch einen ganzen Abschnitt des Berichts – mit Überschriften, Texten, Tabellen und Diagrammen. {{kapitel.inhalt}} erzeugt das Inhaltsverzeichnis samt seiner Überschrift.</w:t>
-      </w:r>
-    </w:p>
-    <w:p>
-      <w:r>
-        <w:t xml:space="preserve">Bei den übrigen Kapiteln steht die Überschrift in der Vorlage, im Absatzformat „EPOS Kapitelkopf“; die Angabe |ohne titel unterdrückt die eigene Überschrift des Kapitels. Entfällt ein Kapitel – abgewählt oder ohne Daten –, entfällt die Überschrift darüber mit. Die Kapitel stehen in der Reihenfolge des bisherigen Berichts.</w:t>
-      </w:r>
-    </w:p>
-  </w:comment>
-</w:comments>
+<w:comments xmlns:cx="http://schemas.microsoft.com/office/drawing/2014/chartex" xmlns:cx1="http://schemas.microsoft.com/office/drawing/2015/9/8/chartex" xmlns:cx2="http://schemas.microsoft.com/office/drawing/2015/10/21/chartex" xmlns:cx3="http://schemas.microsoft.com/office/drawing/2016/5/9/chartex" xmlns:cx4="http://schemas.microsoft.com/office/drawing/2016/5/10/chartex" xmlns:cx5="http://schemas.microsoft.com/office/drawing/2016/5/11/chartex" xmlns:cx6="http://schemas.microsoft.com/office/drawing/2016/5/12/chartex" xmlns:cx7="http://schemas.microsoft.com/office/drawing/2016/5/13/chartex" xmlns:cx8="http://schemas.microsoft.com/office/drawing/2016/5/14/chartex" xmlns:mc="http://schemas.openxmlformats.org/markup-compatibility/2006" xmlns:aink="http://schemas.microsoft.com/office/drawing/2016/ink" xmlns:am3d="http://schemas.microsoft.com/office/drawing/2017/model3d" xmlns:o="urn:schemas-microsoft-com:office:office" xmlns:r="http://schemas.openxmlformats.org/officeDocument/2006/relationships" xmlns:m="http://schemas.openxmlformats.org/officeDocument/2006/math" xmlns:v="urn:schemas-microsoft-com:vml" xmlns:wp14="http://schemas.microsoft.com/office/word/2010/wordprocessingDrawing" xmlns:wp="http://schemas.openxmlformats.org/drawingml/2006/wordprocessingDrawing" xmlns:w10="urn:schemas-microsoft-com:office:word" xmlns:w="http://schemas.openxmlformats.org/wordprocessingml/2006/main" xmlns:w14="http://schemas.microsoft.com/office/word/2010/wordml" xmlns:w15="http://schemas.microsoft.com/office/word/2012/wordml" xmlns:w16cex="http://schemas.microsoft.com/office/word/2018/wordml/cex" xmlns:w16cid="http://schemas.microsoft.com/office/word/2016/wordml/cid" xmlns:w16="http://schemas.microsoft.com/office/word/2018/wordml" xmlns:w16sdtdh="http://schemas.microsoft.com/office/word/2020/wordml/sdtdatahash" xmlns:w16se="http://schemas.microsoft.com/office/word/2015/wordml/symex" xmlns:wpg="http://schemas.microsoft.com/office/word/2010/wordprocessingGroup" xmlns:wpi="http://schemas.microsoft.com/office/word/2010/wordprocessingInk" xmlns:wne="http://schemas.microsoft.com/office/word/2006/wordml" xmlns:wps="http://schemas.microsoft.com/office/word/2010/wordprocessingShape"/>
 </file>
 
 <file path=word/endnotes.xml><?xml version="1.0" encoding="utf-8"?>
@@ -686,7 +661,7 @@
         <wp:inline distT="0" distB="0" distL="0" distR="0">
           <wp:extent cx="857250" cy="466725"/>
           <wp:effectExtent l="0" t="0" r="0" b="0"/>
-          <wp:docPr id="1" name="" descr="" title=""/>
+          <wp:docPr id="1" name="" descr="{{bild.ersteller.logo}}" title=""/>
           <wp:cNvGraphicFramePr>
             <a:graphicFrameLocks xmlns:a="http://schemas.openxmlformats.org/drawingml/2006/main" noChangeAspect="1"/>
           </wp:cNvGraphicFramePr>

</xml_diff>